<commit_message>
Methods: short M_O2 definition
</commit_message>
<xml_diff>
--- a/review_response/Manuscript_AS_tracked_Eq15-16_changes.docx
+++ b/review_response/Manuscript_AS_tracked_Eq15-16_changes.docx
@@ -7969,7 +7969,7 @@
               <m:e>
                 <m:r>
                   <w:rPr>
-                    <w:ins w:id="9601" w:author="Claude" w:date="2026-10-08T05:44:55Z"/>
+                    <w:ins w:id="9701" w:author="Claude" w:date="2026-10-08T05:46:53Z"/>
                     <w:rFonts w:ascii="Cambria Math" w:hAnsi="Cambria Math" w:cs="Times New Roman"/>
                   </w:rPr>
                   <m:t>M</m:t>
@@ -7990,7 +7990,7 @@
                         <m:sty m:val="p"/>
                       </m:rPr>
                       <w:rPr>
-                        <w:ins w:id="9602" w:author="Claude" w:date="2026-10-08T05:44:55Z"/>
+                        <w:ins w:id="9702" w:author="Claude" w:date="2026-10-08T05:46:53Z"/>
                         <w:rFonts w:ascii="Cambria Math" w:hAnsi="Cambria Math" w:cs="Times New Roman"/>
                       </w:rPr>
                       <m:t>O</m:t>
@@ -8002,7 +8002,7 @@
                         <m:sty m:val="p"/>
                       </m:rPr>
                       <w:rPr>
-                        <w:ins w:id="9603" w:author="Claude" w:date="2026-10-08T05:44:55Z"/>
+                        <w:ins w:id="9703" w:author="Claude" w:date="2026-10-08T05:46:53Z"/>
                         <w:rFonts w:ascii="Cambria Math" w:hAnsi="Cambria Math" w:cs="Times New Roman"/>
                       </w:rPr>
                       <m:t>2</m:t>
@@ -8013,7 +8013,7 @@
             </m:sSub>
             <m:r>
               <w:rPr>
-                <w:ins w:id="9604" w:author="Claude" w:date="2026-10-08T05:44:55Z"/>
+                <w:ins w:id="9704" w:author="Claude" w:date="2026-10-08T05:46:53Z"/>
                 <w:rFonts w:ascii="Cambria Math" w:hAnsi="Cambria Math" w:cs="Times New Roman"/>
               </w:rPr>
               <m:t> </m:t>
@@ -8311,7 +8311,7 @@
               <m:e>
                 <m:r>
                   <w:rPr>
-                    <w:ins w:id="9605" w:author="Claude" w:date="2026-10-08T05:44:55Z"/>
+                    <w:ins w:id="9705" w:author="Claude" w:date="2026-10-08T05:46:53Z"/>
                     <w:rFonts w:ascii="Cambria Math" w:hAnsi="Cambria Math" w:cs="Times New Roman"/>
                   </w:rPr>
                   <m:t>M</m:t>
@@ -8332,7 +8332,7 @@
                         <m:sty m:val="p"/>
                       </m:rPr>
                       <w:rPr>
-                        <w:ins w:id="9606" w:author="Claude" w:date="2026-10-08T05:44:55Z"/>
+                        <w:ins w:id="9706" w:author="Claude" w:date="2026-10-08T05:46:53Z"/>
                         <w:rFonts w:ascii="Cambria Math" w:hAnsi="Cambria Math" w:cs="Times New Roman"/>
                       </w:rPr>
                       <m:t>O</m:t>
@@ -8344,7 +8344,7 @@
                         <m:sty m:val="p"/>
                       </m:rPr>
                       <w:rPr>
-                        <w:ins w:id="9607" w:author="Claude" w:date="2026-10-08T05:44:55Z"/>
+                        <w:ins w:id="9707" w:author="Claude" w:date="2026-10-08T05:46:53Z"/>
                         <w:rFonts w:ascii="Cambria Math" w:hAnsi="Cambria Math" w:cs="Times New Roman"/>
                       </w:rPr>
                       <m:t>2</m:t>
@@ -8355,7 +8355,7 @@
             </m:sSub>
             <m:r>
               <w:rPr>
-                <w:ins w:id="9608" w:author="Claude" w:date="2026-10-08T05:44:55Z"/>
+                <w:ins w:id="9708" w:author="Claude" w:date="2026-10-08T05:46:53Z"/>
                 <w:rFonts w:ascii="Cambria Math" w:hAnsi="Cambria Math" w:cs="Times New Roman"/>
               </w:rPr>
               <m:t> </m:t>
@@ -8888,7 +8888,7 @@
         </w:rPr>
         <w:t xml:space="preserve">). In </w:t>
       </w:r>
-      <w:del w:id="9022" w:author="Claude" w:date="2026-10-08T05:44:54Z">
+      <w:del w:id="9014" w:author="Claude" w:date="2026-10-08T05:46:53Z">
         <w:r>
           <w:rPr>
             <w:rFonts w:cs="Times New Roman"/>
@@ -8902,7 +8902,7 @@
         </w:rPr>
         <w:t xml:space="preserve">Eqs. 15 and 16</w:t>
       </w:r>
-      <w:ins w:id="9021" w:author="Claude" w:date="2026-10-08T05:44:54Z">
+      <w:ins w:id="9013" w:author="Claude" w:date="2026-10-08T05:46:53Z">
         <w:r>
           <w:rPr>
             <w:rFonts w:cs="Times New Roman"/>
@@ -8916,7 +8916,7 @@
         </w:rPr>
         <w:t xml:space="preserve"> </w:t>
       </w:r>
-      <w:del w:id="9020" w:author="Claude" w:date="2026-10-08T05:44:54Z">
+      <w:del w:id="9012" w:author="Claude" w:date="2026-10-08T05:46:53Z">
         <w:r>
           <w:rPr>
             <w:rFonts w:cs="Times New Roman"/>
@@ -8924,12 +8924,12 @@
           <w:delText xml:space="preserve">are</w:delText>
         </w:r>
       </w:del>
-      <w:ins w:id="9019" w:author="Claude" w:date="2026-10-08T05:44:54Z">
+      <w:ins w:id="9011" w:author="Claude" w:date="2026-10-08T05:46:53Z">
         <w:r>
           <w:rPr>
             <w:rFonts w:cs="Times New Roman"/>
           </w:rPr>
-          <w:t xml:space="preserve">C_O₂</w:t>
+          <w:t xml:space="preserve">M_O₂</w:t>
         </w:r>
       </w:ins>
       <w:r>
@@ -8938,15 +8938,15 @@
         </w:rPr>
         <w:t xml:space="preserve"> </w:t>
       </w:r>
-      <w:del w:id="9018" w:author="Claude" w:date="2026-10-08T05:44:54Z">
+      <w:del w:id="9010" w:author="Claude" w:date="2026-10-08T05:46:53Z">
         <w:r>
           <w:rPr>
             <w:rFonts w:cs="Times New Roman"/>
           </w:rPr>
-          <w:delText xml:space="preserve">evaluated</w:delText>
+          <w:delText xml:space="preserve">evaluated without</w:delText>
         </w:r>
       </w:del>
-      <w:ins w:id="9017" w:author="Claude" w:date="2026-10-08T05:44:54Z">
+      <w:ins w:id="9009" w:author="Claude" w:date="2026-10-08T05:46:53Z">
         <w:r>
           <w:rPr>
             <w:rFonts w:cs="Times New Roman"/>
@@ -8958,39 +8958,17 @@
         <w:rPr>
           <w:rFonts w:cs="Times New Roman"/>
         </w:rPr>
-        <w:t xml:space="preserve"> </w:t>
-      </w:r>
-      <w:del w:id="9016" w:author="Claude" w:date="2026-10-08T05:44:54Z">
+        <w:t xml:space="preserve"> the </w:t>
+      </w:r>
+      <w:del w:id="9008" w:author="Claude" w:date="2026-10-08T05:46:53Z">
         <w:r>
           <w:rPr>
             <w:rFonts w:cs="Times New Roman"/>
           </w:rPr>
-          <w:delText xml:space="preserve">without</w:delText>
+          <w:delText xml:space="preserve">1/M_O₂ factor (M_O₂ = 32 g mol⁻¹). The calibrated k_ORR is therefore an effective,</w:delText>
         </w:r>
       </w:del>
-      <w:ins w:id="9015" w:author="Claude" w:date="2026-10-08T05:44:54Z">
-        <w:r>
-          <w:rPr>
-            <w:rFonts w:cs="Times New Roman"/>
-          </w:rPr>
-          <w:t xml:space="preserve">a</w:t>
-        </w:r>
-      </w:ins>
-      <w:r>
-        <w:rPr>
-          <w:rFonts w:cs="Times New Roman"/>
-        </w:rPr>
-        <w:t xml:space="preserve"> </w:t>
-      </w:r>
-      <w:del w:id="9014" w:author="Claude" w:date="2026-10-08T05:44:54Z">
-        <w:r>
-          <w:rPr>
-            <w:rFonts w:cs="Times New Roman"/>
-          </w:rPr>
-          <w:delText xml:space="preserve">the</w:delText>
-        </w:r>
-      </w:del>
-      <w:ins w:id="9013" w:author="Claude" w:date="2026-10-08T05:44:54Z">
+      <w:ins w:id="9007" w:author="Claude" w:date="2026-10-08T05:46:53Z">
         <w:r>
           <w:rPr>
             <w:rFonts w:cs="Times New Roman"/>
@@ -9002,152 +8980,74 @@
         <w:rPr>
           <w:rFonts w:cs="Times New Roman"/>
         </w:rPr>
-        <w:t xml:space="preserve"> </w:t>
-      </w:r>
-      <w:del w:id="9012" w:author="Claude" w:date="2026-10-08T05:44:54Z">
+        <w:t xml:space="preserve"> mass</w:t>
+      </w:r>
+      <w:del w:id="9006" w:author="Claude" w:date="2026-10-08T05:46:53Z">
         <w:r>
           <w:rPr>
             <w:rFonts w:cs="Times New Roman"/>
           </w:rPr>
-          <w:delText xml:space="preserve">1/M_O₂</w:delText>
+          <w:delText xml:space="preserve">-basis</w:delText>
         </w:r>
       </w:del>
-      <w:ins w:id="9011" w:author="Claude" w:date="2026-10-08T05:44:54Z">
+      <w:r>
+        <w:rPr>
+          <w:rFonts w:cs="Times New Roman"/>
+        </w:rPr>
+        <w:t xml:space="preserve"> </w:t>
+      </w:r>
+      <w:del w:id="9005" w:author="Claude" w:date="2026-10-08T05:46:53Z">
         <w:r>
           <w:rPr>
             <w:rFonts w:cs="Times New Roman"/>
           </w:rPr>
-          <w:t xml:space="preserve">concentration</w:t>
+          <w:delText xml:space="preserve">coefficient</w:delText>
         </w:r>
-      </w:ins>
-      <w:r>
-        <w:rPr>
-          <w:rFonts w:cs="Times New Roman"/>
-        </w:rPr>
-        <w:t xml:space="preserve"> </w:t>
-      </w:r>
-      <w:del w:id="9010" w:author="Claude" w:date="2026-10-08T05:44:54Z">
+      </w:del>
+      <w:ins w:id="9004" w:author="Claude" w:date="2026-10-08T05:46:53Z">
         <w:r>
           <w:rPr>
             <w:rFonts w:cs="Times New Roman"/>
           </w:rPr>
-          <w:delText xml:space="preserve">factor</w:delText>
+          <w:t xml:space="preserve">of</w:t>
         </w:r>
-      </w:del>
-      <w:ins w:id="9009" w:author="Claude" w:date="2026-10-08T05:44:54Z">
+      </w:ins>
+      <w:r>
+        <w:rPr>
+          <w:rFonts w:cs="Times New Roman"/>
+        </w:rPr>
+        <w:t xml:space="preserve"> </w:t>
+      </w:r>
+      <w:del w:id="9003" w:author="Claude" w:date="2026-10-08T05:46:53Z">
         <w:r>
           <w:rPr>
             <w:rFonts w:cs="Times New Roman"/>
           </w:rPr>
-          <w:t xml:space="preserve">and</w:t>
+          <w:delText xml:space="preserve">(0</w:delText>
         </w:r>
-      </w:ins>
-      <w:r>
-        <w:rPr>
-          <w:rFonts w:cs="Times New Roman"/>
-        </w:rPr>
-        <w:t xml:space="preserve"> </w:t>
-      </w:r>
-      <w:del w:id="9008" w:author="Claude" w:date="2026-10-08T05:44:54Z">
+      </w:del>
+      <w:ins w:id="9002" w:author="Claude" w:date="2026-10-08T05:46:53Z">
         <w:r>
           <w:rPr>
             <w:rFonts w:cs="Times New Roman"/>
           </w:rPr>
-          <w:delText xml:space="preserve">(</w:delText>
+          <w:t xml:space="preserve">O₂</w:t>
         </w:r>
-      </w:del>
-      <w:r>
-        <w:rPr>
-          <w:rFonts w:cs="Times New Roman"/>
-        </w:rPr>
-        <w:t xml:space="preserve">M_O₂ = 32 </w:t>
-      </w:r>
-      <w:ins w:id="9007" w:author="Claude" w:date="2026-10-08T05:44:54Z">
+      </w:ins>
+      <w:r>
+        <w:rPr>
+          <w:rFonts w:cs="Times New Roman"/>
+        </w:rPr>
+        <w:t xml:space="preserve">.</w:t>
+      </w:r>
+      <w:del w:id="9001" w:author="Claude" w:date="2026-10-08T05:46:53Z">
         <w:r>
           <w:rPr>
             <w:rFonts w:cs="Times New Roman"/>
           </w:rPr>
-          <w:t xml:space="preserve">is the numerical value of the molar mass of oxygen (</w:t>
-        </w:r>
-      </w:ins>
-      <w:r>
-        <w:rPr>
-          <w:rFonts w:cs="Times New Roman"/>
-        </w:rPr>
-        <w:t xml:space="preserve">g mol⁻¹). The </w:t>
-      </w:r>
-      <w:del w:id="9006" w:author="Claude" w:date="2026-10-08T05:44:54Z">
-        <w:r>
-          <w:rPr>
-            <w:rFonts w:cs="Times New Roman"/>
-          </w:rPr>
-          <w:delText xml:space="preserve">calibrated</w:delText>
+          <w:delText xml:space="preserve">51 mm h⁻¹ here, equivalent to 16.3 mm h⁻¹ in the mole-consistent form). With this form, the reaction-limited ceiling at k_ORR = 0.51 mm h⁻¹ is 0.29 mm yr⁻¹, above the simulated rates (Section S8).</w:delText>
         </w:r>
       </w:del>
-      <w:ins w:id="9005" w:author="Claude" w:date="2026-10-08T05:44:54Z">
-        <w:r>
-          <w:rPr>
-            <w:rFonts w:cs="Times New Roman"/>
-          </w:rPr>
-          <w:t xml:space="preserve">factor appears because the solver stores O₂ as a mass concentration and evaluates the ORR velocity without a molar-mass conversion; a stoichiometrically consistent formulation would omit it. The O₂ sink in Eq. 7 uses</w:t>
-        </w:r>
-      </w:ins>
-      <w:r>
-        <w:rPr>
-          <w:rFonts w:cs="Times New Roman"/>
-        </w:rPr>
-        <w:t xml:space="preserve"> k_ORR </w:t>
-      </w:r>
-      <w:del w:id="9004" w:author="Claude" w:date="2026-10-08T05:44:54Z">
-        <w:r>
-          <w:rPr>
-            <w:rFonts w:cs="Times New Roman"/>
-          </w:rPr>
-          <w:delText xml:space="preserve">is therefore an effective, mass-basis coefficient (0.51 mm h⁻¹ here, equivalent to 16.3 mm h⁻¹ in the mole-consistent form)</w:delText>
-        </w:r>
-      </w:del>
-      <w:ins w:id="9003" w:author="Claude" w:date="2026-10-08T05:44:54Z">
-        <w:r>
-          <w:rPr>
-            <w:rFonts w:cs="Times New Roman"/>
-          </w:rPr>
-          <w:t xml:space="preserve">directly</w:t>
-        </w:r>
-      </w:ins>
-      <w:r>
-        <w:rPr>
-          <w:rFonts w:cs="Times New Roman"/>
-        </w:rPr>
-        <w:t xml:space="preserve">. With</w:t>
-      </w:r>
-      <w:del w:id="9002" w:author="Claude" w:date="2026-10-08T05:44:54Z">
-        <w:r>
-          <w:rPr>
-            <w:rFonts w:cs="Times New Roman"/>
-          </w:rPr>
-          <w:delText xml:space="preserve"> this form, the reaction-limited ceiling at</w:delText>
-        </w:r>
-      </w:del>
-      <w:r>
-        <w:rPr>
-          <w:rFonts w:cs="Times New Roman"/>
-        </w:rPr>
-        <w:t xml:space="preserve"> k_ORR = 0.51 mm h⁻¹</w:t>
-      </w:r>
-      <w:ins w:id="9001" w:author="Claude" w:date="2026-10-08T05:44:54Z">
-        <w:r>
-          <w:rPr>
-            <w:rFonts w:cs="Times New Roman"/>
-          </w:rPr>
-          <w:t xml:space="preserve">, the reaction-limited ceiling</w:t>
-        </w:r>
-      </w:ins>
-      <w:r>
-        <w:rPr>
-          <w:rFonts w:cs="Times New Roman"/>
-        </w:rPr>
-        <w:t xml:space="preserve"> is 0.29 mm yr⁻¹, above the simulated rates (Section S8).</w:t>
-      </w:r>
     </w:p>
     <w:p>
       <w:pPr>
@@ -15836,7 +15736,7 @@
       <w:tr>
         <w:trPr>
           <w:cantSplit/>
-          <w:ins w:id="9609" w:author="Claude" w:date="2026-10-08T05:44:55Z"/>
+          <w:ins w:id="9709" w:author="Claude" w:date="2026-10-08T05:46:53Z"/>
         </w:trPr>
         <w:tc>
           <w:tcPr>
@@ -15853,7 +15753,7 @@
                 <w:szCs w:val="22"/>
               </w:rPr>
             </w:pPr>
-            <w:ins w:id="9610" w:author="Claude" w:date="2026-10-08T05:44:55Z">
+            <w:ins w:id="9710" w:author="Claude" w:date="2026-10-08T05:46:53Z">
               <w:r>
                 <w:t>M(O₂)</w:t>
               </w:r>
@@ -15875,7 +15775,7 @@
                 <w:szCs w:val="22"/>
               </w:rPr>
             </w:pPr>
-            <w:ins w:id="9611" w:author="Claude" w:date="2026-10-08T05:44:55Z">
+            <w:ins w:id="9711" w:author="Claude" w:date="2026-10-08T05:46:53Z">
               <w:r>
                 <w:t>g mol⁻¹</w:t>
               </w:r>
@@ -15897,7 +15797,7 @@
                 <w:szCs w:val="22"/>
               </w:rPr>
             </w:pPr>
-            <w:ins w:id="9612" w:author="Claude" w:date="2026-10-08T05:44:55Z">
+            <w:ins w:id="9712" w:author="Claude" w:date="2026-10-08T05:46:53Z">
               <w:r>
                 <w:t>fixed</w:t>
               </w:r>
@@ -15919,7 +15819,7 @@
                 <w:szCs w:val="22"/>
               </w:rPr>
             </w:pPr>
-            <w:ins w:id="9613" w:author="Claude" w:date="2026-10-08T05:44:55Z">
+            <w:ins w:id="9713" w:author="Claude" w:date="2026-10-08T05:46:53Z">
               <w:r>
                 <w:t>32</w:t>
               </w:r>

</xml_diff>